<commit_message>
Add QA rules and skill improvements from job application session
- qa_and_delivery.md: Add hard rules for page count (user must confirm in
  Word), page gap fill (target 7200-7350 chars), minimum 3 bullets per
  role, and reverse-chronological publication order; expand pre-delivery
  checklist with bullet length and duplicate content checks
- xml_editing_guide.md: Add warning section on editing existing output
  files (never use prepare/create scripts on files already in outputs/)
- SKILL.md: Add same existing-output-file warning to manual workflow;
  remove stale "Use bullet formatting" note from KA section
- Ted_Cohen-RESUME.docx: Updated baseline resume
- .gitignore: Broaden unpacked dir pattern from unpacked/ to unpacked_*/

Co-Authored-By: Claude Sonnet 4.6 <noreply@anthropic.com>
</commit_message>
<xml_diff>
--- a/skills/job-application-helper/assets/Ted_Cohen-RESUME.docx
+++ b/skills/job-application-helper/assets/Ted_Cohen-RESUME.docx
@@ -4846,7 +4846,6 @@
         <w:docPartUnique/>
       </w:docPartObj>
     </w:sdtPr>
-    <w:sdtEndPr/>
     <w:sdtContent>
       <w:sdt>
         <w:sdtPr>
@@ -4860,7 +4859,6 @@
             <w:docPartUnique/>
           </w:docPartObj>
         </w:sdtPr>
-        <w:sdtEndPr/>
         <w:sdtContent>
           <w:p>
             <w:pPr>
@@ -5004,7 +5002,6 @@
         <w:docPartUnique/>
       </w:docPartObj>
     </w:sdtPr>
-    <w:sdtEndPr/>
     <w:sdtContent>
       <w:sdt>
         <w:sdtPr>
@@ -5018,7 +5015,6 @@
             <w:docPartUnique/>
           </w:docPartObj>
         </w:sdtPr>
-        <w:sdtEndPr/>
         <w:sdtContent>
           <w:p>
             <w:pPr>

</xml_diff>

<commit_message>
Add md_to_docx converter and auto-generate .docx from study guides
- Add skills/interview-study-guide/assets/md_to_docx.py: markdown-to-Word
  converter using python-docx with blue/grey heading hierarchy, styled
  tables, alternating row shading, and shaded code blocks
- Update interview-study-guide SKILL.md: Step 4 now auto-runs md_to_docx.py
  after saving the .md, so every future study guide produces both formats
- Sync pre-existing user_profile.md, qa_and_delivery.md, and resume changes

Co-Authored-By: Claude Sonnet 4.6 <noreply@anthropic.com>
</commit_message>
<xml_diff>
--- a/skills/job-application-helper/assets/Ted_Cohen-RESUME.docx
+++ b/skills/job-application-helper/assets/Ted_Cohen-RESUME.docx
@@ -4846,6 +4846,7 @@
         <w:docPartUnique/>
       </w:docPartObj>
     </w:sdtPr>
+    <w:sdtEndPr/>
     <w:sdtContent>
       <w:sdt>
         <w:sdtPr>
@@ -4859,6 +4860,7 @@
             <w:docPartUnique/>
           </w:docPartObj>
         </w:sdtPr>
+        <w:sdtEndPr/>
         <w:sdtContent>
           <w:p>
             <w:pPr>
@@ -5002,6 +5004,7 @@
         <w:docPartUnique/>
       </w:docPartObj>
     </w:sdtPr>
+    <w:sdtEndPr/>
     <w:sdtContent>
       <w:sdt>
         <w:sdtPr>
@@ -5015,6 +5018,7 @@
             <w:docPartUnique/>
           </w:docPartObj>
         </w:sdtPr>
+        <w:sdtEndPr/>
         <w:sdtContent>
           <w:p>
             <w:pPr>

</xml_diff>